<commit_message>
Report: add team names, Lab CA mini project line, drop roll number, use 'we'
Co-Authored-By: Claude Sonnet 5.5 <noreply@anthropic.com>
Claude-Session: https://claude.ai/code/session_01SARJowU4tQmSSTkW5fKqZq
</commit_message>
<xml_diff>
--- a/report/EdgeFall_Edge_AI_Report.docx
+++ b/report/EdgeFall_Edge_AI_Report.docx
@@ -69,7 +69,7 @@
           <w:sz w:val="28"/>
           <w:szCs w:val="28"/>
         </w:rPr>
-        <w:t xml:space="preserve">Edge AI Mini Project Report</w:t>
+        <w:t xml:space="preserve">Edge AI Lab CA Mini Project Report</w:t>
       </w:r>
     </w:p>
     <w:p>
@@ -97,7 +97,7 @@
     </w:p>
     <w:p>
       <w:pPr>
-        <w:spacing w:after="80" w:before="0"/>
+        <w:spacing w:after="40" w:before="0"/>
         <w:jc w:val="center"/>
       </w:pPr>
       <w:r>
@@ -105,10 +105,72 @@
           <w:rFonts w:ascii="Times New Roman" w:cs="Times New Roman" w:eastAsia="Times New Roman" w:hAnsi="Times New Roman"/>
           <w:b/>
           <w:bCs/>
-          <w:sz w:val="28"/>
-          <w:szCs w:val="28"/>
+          <w:sz w:val="26"/>
+          <w:szCs w:val="26"/>
         </w:rPr>
         <w:t xml:space="preserve">Pradyum Mistry</w:t>
+      </w:r>
+    </w:p>
+    <w:p>
+      <w:pPr>
+        <w:spacing w:after="40" w:before="0"/>
+        <w:jc w:val="center"/>
+      </w:pPr>
+      <w:r>
+        <w:rPr>
+          <w:rFonts w:ascii="Times New Roman" w:cs="Times New Roman" w:eastAsia="Times New Roman" w:hAnsi="Times New Roman"/>
+          <w:b/>
+          <w:bCs/>
+          <w:sz w:val="26"/>
+          <w:szCs w:val="26"/>
+        </w:rPr>
+        <w:t xml:space="preserve">Rayan Kokate</w:t>
+      </w:r>
+    </w:p>
+    <w:p>
+      <w:pPr>
+        <w:spacing w:after="40" w:before="0"/>
+        <w:jc w:val="center"/>
+      </w:pPr>
+      <w:r>
+        <w:rPr>
+          <w:rFonts w:ascii="Times New Roman" w:cs="Times New Roman" w:eastAsia="Times New Roman" w:hAnsi="Times New Roman"/>
+          <w:b/>
+          <w:bCs/>
+          <w:sz w:val="26"/>
+          <w:szCs w:val="26"/>
+        </w:rPr>
+        <w:t xml:space="preserve">Aryan Raut</w:t>
+      </w:r>
+    </w:p>
+    <w:p>
+      <w:pPr>
+        <w:spacing w:after="40" w:before="0"/>
+        <w:jc w:val="center"/>
+      </w:pPr>
+      <w:r>
+        <w:rPr>
+          <w:rFonts w:ascii="Times New Roman" w:cs="Times New Roman" w:eastAsia="Times New Roman" w:hAnsi="Times New Roman"/>
+          <w:b/>
+          <w:bCs/>
+          <w:sz w:val="26"/>
+          <w:szCs w:val="26"/>
+        </w:rPr>
+        <w:t xml:space="preserve">Satvik Gupta</w:t>
+      </w:r>
+    </w:p>
+    <w:p>
+      <w:pPr>
+        <w:spacing w:after="40" w:before="0"/>
+        <w:jc w:val="center"/>
+      </w:pPr>
+      <w:r>
+        <w:rPr>
+          <w:rFonts w:ascii="Times New Roman" w:cs="Times New Roman" w:eastAsia="Times New Roman" w:hAnsi="Times New Roman"/>
+          <w:sz w:val="24"/>
+          <w:szCs w:val="24"/>
+        </w:rPr>
+        <w:t xml:space="preserve"/>
       </w:r>
     </w:p>
     <w:p>
@@ -122,12 +184,12 @@
           <w:sz w:val="24"/>
           <w:szCs w:val="24"/>
         </w:rPr>
-        <w:t xml:space="preserve">Roll No. 16010123236</w:t>
-      </w:r>
-    </w:p>
-    <w:p>
-      <w:pPr>
-        <w:spacing w:after="60" w:before="0"/>
+        <w:t xml:space="preserve">B.Tech Computer Engineering, Last Year</w:t>
+      </w:r>
+    </w:p>
+    <w:p>
+      <w:pPr>
+        <w:spacing w:after="360" w:before="0"/>
         <w:jc w:val="center"/>
       </w:pPr>
       <w:r>
@@ -136,12 +198,12 @@
           <w:sz w:val="24"/>
           <w:szCs w:val="24"/>
         </w:rPr>
-        <w:t xml:space="preserve">B.Tech Computer Engineering, Last Year</w:t>
-      </w:r>
-    </w:p>
-    <w:p>
-      <w:pPr>
-        <w:spacing w:after="360" w:before="0"/>
+        <w:t xml:space="preserve">K. J. Somaiya School of Engineering, Mumbai</w:t>
+      </w:r>
+    </w:p>
+    <w:p>
+      <w:pPr>
+        <w:spacing w:after="20" w:before="0"/>
         <w:jc w:val="center"/>
       </w:pPr>
       <w:r>
@@ -150,21 +212,7 @@
           <w:sz w:val="24"/>
           <w:szCs w:val="24"/>
         </w:rPr>
-        <w:t xml:space="preserve">K. J. Somaiya School of Engineering, Mumbai</w:t>
-      </w:r>
-    </w:p>
-    <w:p>
-      <w:pPr>
-        <w:spacing w:after="20" w:before="0"/>
-        <w:jc w:val="center"/>
-      </w:pPr>
-      <w:r>
-        <w:rPr>
-          <w:rFonts w:ascii="Times New Roman" w:cs="Times New Roman" w:eastAsia="Times New Roman" w:hAnsi="Times New Roman"/>
-          <w:sz w:val="24"/>
-          <w:szCs w:val="24"/>
-        </w:rPr>
-        <w:t xml:space="preserve">Edge AI, Semester VII, 2026-2027</w:t>
+        <w:t xml:space="preserve">Edge AI (Lab CA Mini Project), Semester VII, 2026-2027</w:t>
       </w:r>
     </w:p>
     <w:p>
@@ -195,7 +243,7 @@
         </w:rPr>
         <w:t xml:space="preserve">Code: </w:t>
       </w:r>
-      <w:hyperlink w:history="1" r:id="rIdwigylid8x3py4puafmedo">
+      <w:hyperlink w:history="1" r:id="rIdiobrgvtj5ct3nm0tf2min">
         <w:r>
           <w:rPr>
             <w:rFonts w:ascii="Times New Roman" w:cs="Times New Roman" w:eastAsia="Times New Roman" w:hAnsi="Times New Roman"/>
@@ -219,7 +267,7 @@
         </w:rPr>
         <w:t xml:space="preserve">Download (Releases): </w:t>
       </w:r>
-      <w:hyperlink w:history="1" r:id="rId45828sky6xpaty8wqsuy3">
+      <w:hyperlink w:history="1" r:id="rIdn7j5k3gh7hm14to_nqhbz">
         <w:r>
           <w:rPr>
             <w:rFonts w:ascii="Times New Roman" w:cs="Times New Roman" w:eastAsia="Times New Roman" w:hAnsi="Times New Roman"/>
@@ -267,7 +315,7 @@
         <w:rPr>
           <w:rFonts w:ascii="Times New Roman" w:cs="Times New Roman" w:eastAsia="Times New Roman" w:hAnsi="Times New Roman"/>
         </w:rPr>
-        <w:t xml:space="preserve">I trained the network on SisFall, a public dataset of falls and everyday movements recorded from 38 volunteers [1]. Each recording is converted to physical units, reduced to acceleration magnitude, rotation magnitude and jerk, downsampled from 200 Hz to 50 Hz and cut into 2-second windows. After post-training quantization the model is 11,664 bytes (11.4 KB). On five volunteers who were held out of training, the model in the app catches 90% of fall windows at 59% precision with a 0.9 threshold. The app itself uses a stricter 0.95 threshold and needs two positive windows in a row, which gives 81% recall and 62% precision per window.</w:t>
+        <w:t xml:space="preserve">We trained the network on SisFall, a public dataset of falls and everyday movements recorded from 38 volunteers [1]. Each recording is converted to physical units, reduced to acceleration magnitude, rotation magnitude and jerk, downsampled from 200 Hz to 50 Hz and cut into 2-second windows. After post-training quantization the model is 11,664 bytes (11.4 KB). On five volunteers who were held out of training, the model in the app catches 90% of fall windows at 59% precision with a 0.9 threshold. The app itself uses a stricter 0.95 threshold and needs two positive windows in a row, which gives 81% recall and 62% precision per window.</w:t>
       </w:r>
     </w:p>
     <w:p>
@@ -279,7 +327,7 @@
         <w:rPr>
           <w:rFonts w:ascii="Times New Roman" w:cs="Times New Roman" w:eastAsia="Times New Roman" w:hAnsi="Times New Roman"/>
         </w:rPr>
-        <w:t xml:space="preserve">For the compression part of the course I ran a separate, seeded training run and compared it with its own float32 baseline. Quantization cut the TFLite file from 18.5 KB to 11.4 KB with no change in precision or recall. Structured pruning, which removed half the filters in each convolution layer, cut the parameters by 68% and, after fine-tuning, scored about the same F1 as the unpruned model (0.87 against 0.86). The main limits are that SisFall's falls were performed onto a mattress by people wearing a belt sensor, so a bare phone dropped on a bed can trigger a false alarm, and that I measured latency on a server CPU and not on the phone.</w:t>
+        <w:t xml:space="preserve">For the compression part of the course we ran a separate, seeded training run and compared it with its own float32 baseline. Quantization cut the TFLite file from 18.5 KB to 11.4 KB with no change in precision or recall. Structured pruning, which removed half the filters in each convolution layer, cut the parameters by 68% and, after fine-tuning, scored about the same F1 as the unpruned model (0.87 against 0.86). The main limits are that SisFall's falls were performed onto a mattress by people wearing a belt sensor, so a bare phone dropped on a bed can trigger a false alarm, and that we measured latency on a server CPU and not on the phone.</w:t>
       </w:r>
     </w:p>
     <w:p>
@@ -1579,7 +1627,7 @@
         <w:rPr>
           <w:rFonts w:ascii="Times New Roman" w:cs="Times New Roman" w:eastAsia="Times New Roman" w:hAnsi="Times New Roman"/>
         </w:rPr>
-        <w:t xml:space="preserve">I wanted a fall detector that works with no extra hardware, no account and no internet connection. Three things pushed me towards running it on the phone. The first is privacy: motion data can show when someone is home, asleep or walking, so it is better if it never leaves the device. The second is reliability: a phone in a lift or a basement may have no signal, and the alert should still fire. The third is cost, since a model that fits in about 11 KB can run continuously in the background, which a cloud round trip every 100 ms could not.</w:t>
+        <w:t xml:space="preserve">We wanted a fall detector that works with no extra hardware, no account and no internet connection. Three things pushed us towards running it on the phone. The first is privacy: motion data can show when someone is home, asleep or walking, so it is better if it never leaves the device. The second is reliability: a phone in a lift or a basement may have no signal, and the alert should still fire. The third is cost, since a model that fits in about 11 KB can run continuously in the background, which a cloud round trip every 100 ms could not.</w:t>
       </w:r>
     </w:p>
     <w:p>
@@ -2527,7 +2575,7 @@
         <w:rPr>
           <w:rFonts w:ascii="Times New Roman" w:cs="Times New Roman" w:eastAsia="Times New Roman" w:hAnsi="Times New Roman"/>
         </w:rPr>
-        <w:t xml:space="preserve">Table 2 lists the software. The Python side does the data preparation, training, compression and evaluation. The Flutter side is only the way the model reaches a phone: it reads the sensors [7], runs the model and shows notifications, so I describe it briefly.</w:t>
+        <w:t xml:space="preserve">Table 2 lists the software. The Python side does the data preparation, training, compression and evaluation. The Flutter side is only the way the model reaches a phone: it reads the sensors [7], runs the model and shows notifications, so we describe it briefly.</w:t>
       </w:r>
     </w:p>
     <w:p>
@@ -3979,7 +4027,7 @@
         <w:rPr>
           <w:rFonts w:ascii="Times New Roman" w:cs="Times New Roman" w:eastAsia="Times New Roman" w:hAnsi="Times New Roman"/>
         </w:rPr>
-        <w:t xml:space="preserve">I used SisFall [1]. It has recordings from 38 volunteers: 23 young adults (IDs starting with SA, aged 19 to 30) and 15 elderly people (SE, aged 60 to 75). Each volunteer performed 19 kinds of everyday movement, called ADLs (activities of daily living), such as walking, jogging, climbing stairs, sitting down and getting into a car. The young adults also performed 15 kinds of fall, among them slips, trips and fainting while walking, and falls while sitting down or getting up. The only elderly volunteer who simulated falls was SE06. The sensors were a waist-mounted ADXL345 accelerometer and an ITG3200 gyroscope sampled at 200 Hz. The dataset also has a second accelerometer (MMA8451Q) that I ignored, because its +-8 g range clips during hard impacts. The original host is offline, so I used a community mirror [11], which has 4,505 recording files.</w:t>
+        <w:t xml:space="preserve">We used SisFall [1]. It has recordings from 38 volunteers: 23 young adults (IDs starting with SA, aged 19 to 30) and 15 elderly people (SE, aged 60 to 75). Each volunteer performed 19 kinds of everyday movement, called ADLs (activities of daily living), such as walking, jogging, climbing stairs, sitting down and getting into a car. The young adults also performed 15 kinds of fall, among them slips, trips and fainting while walking, and falls while sitting down or getting up. The only elderly volunteer who simulated falls was SE06. The sensors were a waist-mounted ADXL345 accelerometer and an ITG3200 gyroscope sampled at 200 Hz. The dataset also has a second accelerometer (MMA8451Q) that we ignored, because its +-8 g range clips during hard impacts. The original host is offline, so we used a community mirror [11], which has 4,505 recording files.</w:t>
       </w:r>
     </w:p>
     <w:p>
@@ -4674,7 +4722,7 @@
         <w:rPr>
           <w:rFonts w:ascii="Times New Roman" w:cs="Times New Roman" w:eastAsia="Times New Roman" w:hAnsi="Times New Roman"/>
         </w:rPr>
-        <w:t xml:space="preserve">I used fixed constants and not the dataset's mean and standard deviation, because SisFall's belt-mounted sensor and a phone in a pocket see different signals. The constants are rough upper limits that I chose by hand: about 3 g of acceleration, about 570 degrees per second of rotation, and roughly the 99th percentile of jerk in the data. I did not tune them. The same numbers are in the Dart code, because the model only works if the phone scales its input exactly as training did.</w:t>
+        <w:t xml:space="preserve">We used fixed constants and not the dataset's mean and standard deviation, because SisFall's belt-mounted sensor and a phone in a pocket see different signals. The constants are rough upper limits that we chose by hand: about 3 g of acceleration, about 570 degrees per second of rotation, and roughly the 99th percentile of jerk in the data. We did not tune them. The same numbers are in the Dart code, because the model only works if the phone scales its input exactly as training did.</w:t>
       </w:r>
     </w:p>
     <w:p>
@@ -4704,7 +4752,7 @@
         <w:rPr>
           <w:rFonts w:ascii="Times New Roman" w:cs="Times New Roman" w:eastAsia="Times New Roman" w:hAnsi="Times New Roman"/>
         </w:rPr>
-        <w:t xml:space="preserve">I split by volunteer and not by window. If windows from the same person end up in both the training and test sets, the model can learn that person's movement style and the test score looks better than it should. With a subject-wise split the test set only holds people the model has never seen. A seeded shuffle (seed 42) gave the split in Table 4.</w:t>
+        <w:t xml:space="preserve">We split by volunteer and not by window. If windows from the same person end up in both the training and test sets, the model can learn that person's movement style and the test score looks better than it should. With a subject-wise split the test set only holds people the model has never seen. A seeded shuffle (seed 42) gave the split in Table 4.</w:t>
       </w:r>
     </w:p>
     <w:p>
@@ -5351,7 +5399,7 @@
         <w:rPr>
           <w:rFonts w:ascii="Times New Roman" w:cs="Times New Roman" w:eastAsia="Times New Roman" w:hAnsi="Times New Roman"/>
         </w:rPr>
-        <w:t xml:space="preserve">A fall is a short pattern in a time series: acceleration drops towards zero while falling, spikes on impact, and then the body is still. A 1D convolution slides small filters along the time axis and learns to spot patterns like that wherever they occur in the window. The three channels play the role that red, green and blue play in an image. I picked a CNN over a recurrent network because it is smaller, processes all time steps at once and quantizes well. I did not train a recurrent model, so I cannot say how it would compare. I picked a learned model over a hand-written threshold rule (the first version of the app, still in the repository as fall_detector.dart) because a learned model can use the whole window of data and not only a few trigger conditions.</w:t>
+        <w:t xml:space="preserve">A fall is a short pattern in a time series: acceleration drops towards zero while falling, spikes on impact, and then the body is still. A 1D convolution slides small filters along the time axis and learns to spot patterns like that wherever they occur in the window. The three channels play the role that red, green and blue play in an image. We picked a CNN over a recurrent network because it is smaller, processes all time steps at once and quantizes well. We did not train a recurrent model, so we cannot say how it would compare. We picked a learned model over a hand-written threshold rule (the first version of the app, still in the repository as fall_detector.dart) because a learned model can use the whole window of data and not only a few trigger conditions.</w:t>
       </w:r>
     </w:p>
     <w:p>
@@ -5393,7 +5441,7 @@
         <w:rPr>
           <w:rFonts w:ascii="Times New Roman" w:cs="Times New Roman" w:eastAsia="Times New Roman" w:hAnsi="Times New Roman"/>
         </w:rPr>
-        <w:t xml:space="preserve">I trained with the Adam optimizer [4] and the settings in Table 5. Falls are only 6.5% of the windows, so a model that always answered "no fall" would be right 93.5% of the time. The class weight makes a missed fall cost about 14 times more than a false alarm during training. I stopped on validation recall because a missed fall is the worse mistake.</w:t>
+        <w:t xml:space="preserve">We trained with the Adam optimizer [4] and the settings in Table 5. Falls are only 6.5% of the windows, so a model that always answered "no fall" would be right 93.5% of the time. The class weight makes a missed fall cost about 14 times more than a false alarm during training. We stopped on validation recall because a missed fall is the worse mistake.</w:t>
       </w:r>
     </w:p>
     <w:p>
@@ -6175,7 +6223,7 @@
         <w:rPr>
           <w:rFonts w:ascii="Times New Roman" w:cs="Times New Roman" w:eastAsia="Times New Roman" w:hAnsi="Times New Roman"/>
         </w:rPr>
-        <w:t xml:space="preserve">I trained the network twice with the same code. The first run produced the model that ships in the app, and its training history was not saved. For this report I ran training again with a fixed random seed and saved the history. I use that second run for the compression experiments and for the curves in Figure 2. Early stopping ended the second run after 13 epochs and restored the weights from epoch 5, which had the best validation recall. The validation loss is lower than the training loss because the training loss includes the class weights and the validation loss does not.</w:t>
+        <w:t xml:space="preserve">We trained the network twice with the same code. The first run produced the model that ships in the app, and its training history was not saved. For this report we ran training again with a fixed random seed and saved the history. We use that second run for the compression experiments and for the curves in Figure 2. Early stopping ended the second run after 13 epochs and restored the weights from epoch 5, which had the best validation recall. The validation loss is lower than the training loss because the training loss includes the class weights and the validation loss does not.</w:t>
       </w:r>
     </w:p>
     <w:p>
@@ -6259,7 +6307,7 @@
         <w:rPr>
           <w:rFonts w:ascii="Times New Roman" w:cs="Times New Roman" w:eastAsia="Times New Roman" w:hAnsi="Times New Roman"/>
         </w:rPr>
-        <w:t xml:space="preserve">The baseline is already small, at 3,393 parameters. Compression here is less about making a huge model fit and more about seeing how much further a small one can shrink and what each step costs. I tried two techniques, structured pruning and post-training quantization. All numbers in this section and in Section 4 come from compression_experiments.py, which starts from the seeded re-run's float32 model and is evaluated on the same 3,611 test windows.</w:t>
+        <w:t xml:space="preserve">The baseline is already small, at 3,393 parameters. Compression here is less about making a huge model fit and more about seeing how much further a small one can shrink and what each step costs. We tried two techniques, structured pruning and post-training quantization. All numbers in this section and in Section 4 come from compression_experiments.py, which starts from the seeded re-run's float32 model and is evaluated on the same 3,611 test windows.</w:t>
       </w:r>
     </w:p>
     <w:p>
@@ -6282,7 +6330,7 @@
         <w:rPr>
           <w:rFonts w:ascii="Times New Roman" w:cs="Times New Roman" w:eastAsia="Times New Roman" w:hAnsi="Times New Roman"/>
         </w:rPr>
-        <w:t xml:space="preserve">Pruning removes the parts of a network that contribute little. Unstructured pruning zeroes individual weights, which leaves every layer the same shape and gives no speed-up on ordinary hardware unless special sparse kernels exist. Structured pruning removes whole filters, so the layers really get smaller. I used the L1-norm method of Li et al. [2]: rank each filter by the sum of the absolute values of its weights, and drop the filters with the smallest sums.</w:t>
+        <w:t xml:space="preserve">Pruning removes the parts of a network that contribute little. Unstructured pruning zeroes individual weights, which leaves every layer the same shape and gives no speed-up on ordinary hardware unless special sparse kernels exist. Structured pruning removes whole filters, so the layers really get smaller. We used the L1-norm method of Li et al. [2]: rank each filter by the sum of the absolute values of its weights, and drop the filters with the smallest sums.</w:t>
       </w:r>
     </w:p>
     <w:p>
@@ -6294,7 +6342,7 @@
         <w:rPr>
           <w:rFonts w:ascii="Times New Roman" w:cs="Times New Roman" w:eastAsia="Times New Roman" w:hAnsi="Times New Roman"/>
         </w:rPr>
-        <w:t xml:space="preserve">I kept half of the filters in each convolution layer: 8 of 16 in the first and 16 of 32 in the second. Removing a filter from the first layer also removes the matching input channel of the second layer, and removing one from the second layer removes the matching input row of the dense layer, so I sliced those weights as well. Then I fine-tuned the smaller network with the same recipe as before (class weights and early stopping on validation recall).</w:t>
+        <w:t xml:space="preserve">We kept half of the filters in each convolution layer: 8 of 16 in the first and 16 of 32 in the second. Removing a filter from the first layer also removes the matching input channel of the second layer, and removing one from the second layer removes the matching input row of the dense layer, so we sliced those weights as well. Then we fine-tuned the smaller network with the same recipe as before (class weights and early stopping on validation recall).</w:t>
       </w:r>
     </w:p>
     <w:p>
@@ -6990,7 +7038,7 @@
         <w:rPr>
           <w:rFonts w:ascii="Times New Roman" w:cs="Times New Roman" w:eastAsia="Times New Roman" w:hAnsi="Times New Roman"/>
         </w:rPr>
-        <w:t xml:space="preserve">Right after pruning, before any fine-tuning, the model still ranked windows reasonably well (ROC AUC 0.936 against 0.971), but its scores shifted: at the 0.9 threshold precision fell to 0.39 while recall stayed at 0.93. Fine-tuning fixed that. The fine-tuned pruned model scored precision 0.87, recall 0.87 and F1 0.869 at the same threshold, against 0.88, 0.84 and 0.858 for the unpruned model (Table 9). I would not read the small gain as pruning improving the model. The test set has only 225 falls and this is a single run, so differences of a point or two are within noise. What I can say is that half the filters were not needed for this task. I did not put the pruned model in the app, which still uses the unpruned quantized model.</w:t>
+        <w:t xml:space="preserve">Right after pruning, before any fine-tuning, the model still ranked windows reasonably well (ROC AUC 0.936 against 0.971), but its scores shifted: at the 0.9 threshold precision fell to 0.39 while recall stayed at 0.93. Fine-tuning fixed that. The fine-tuned pruned model scored precision 0.87, recall 0.87 and F1 0.869 at the same threshold, against 0.88, 0.84 and 0.858 for the unpruned model (Table 9). We would not read the small gain as pruning improving the model. The test set has only 225 falls and this is a single run, so differences of a point or two are within noise. What we can say is that half the filters were not needed for this task. We did not put the pruned model in the app, which still uses the unpruned quantized model.</w:t>
       </w:r>
     </w:p>
     <w:p>
@@ -7013,7 +7061,7 @@
         <w:rPr>
           <w:rFonts w:ascii="Times New Roman" w:cs="Times New Roman" w:eastAsia="Times New Roman" w:hAnsi="Times New Roman"/>
         </w:rPr>
-        <w:t xml:space="preserve">Quantization stores numbers with fewer bits. I used post-training dynamic-range quantization [3][5]. After training, the converter stores the weights as 8-bit integers and converts them back to float while computing, and the activations stay in floating point. It needs no calibration data and no retraining, and it is one line in the converter:</w:t>
+        <w:t xml:space="preserve">Quantization stores numbers with fewer bits. We used post-training dynamic-range quantization [3][5]. After training, the converter stores the weights as 8-bit integers and converts them back to float while computing, and the activations stay in floating point. It needs no calibration data and no retraining, and it is one line in the converter:</w:t>
       </w:r>
     </w:p>
     <w:p>
@@ -7084,7 +7132,7 @@
         <w:rPr>
           <w:rFonts w:ascii="Times New Roman" w:cs="Times New Roman" w:eastAsia="Times New Roman" w:hAnsi="Times New Roman"/>
         </w:rPr>
-        <w:t xml:space="preserve">The file shrank from 18.5 KB to 11.4 KB, a 38.3% reduction, and the outputs barely moved. At the 0.9 threshold precision, recall and F1 were identical to the float32 TFLite model, and ROC AUC differed only in the fifth decimal place (0.97091 against 0.97092). The saving is smaller than the 4x that 8-bit weights suggest. As far as I can tell, the converter leaves weight tensors with fewer than 1,024 elements in float, because the saving is too small to justify the conversion work. In this network only the second convolution layer (5 x 16 x 32 = 2,560 weights) is large enough. The pruned model supports this reading: none of its tensors reaches 1,024 elements, and its quantized and float files are exactly the same size (9.4 KB).</w:t>
+        <w:t xml:space="preserve">The file shrank from 18.5 KB to 11.4 KB, a 38.3% reduction, and the outputs barely moved. At the 0.9 threshold precision, recall and F1 were identical to the float32 TFLite model, and ROC AUC differed only in the fifth decimal place (0.97091 against 0.97092). The saving is smaller than the 4x that 8-bit weights suggest. As far as we can tell, the converter leaves weight tensors with fewer than 1,024 elements in float, because the saving is too small to justify the conversion work. In this network only the second convolution layer (5 x 16 x 32 = 2,560 weights) is large enough. The pruned model supports this reading: none of its tensors reaches 1,024 elements, and its quantized and float files are exactly the same size (9.4 KB).</w:t>
       </w:r>
     </w:p>
     <w:p>
@@ -7218,7 +7266,7 @@
         <w:rPr>
           <w:rFonts w:ascii="Times New Roman" w:cs="Times New Roman" w:eastAsia="Times New Roman" w:hAnsi="Times New Roman"/>
         </w:rPr>
-        <w:t xml:space="preserve">All results use the same test set: 3,611 windows from five volunteers who were never used for training or for deciding when to stop (225 fall windows and 3,386 ADL windows). Two trained models appear in this section and I keep them apart on purpose. The </w:t>
+        <w:t xml:space="preserve">All results use the same test set: 3,611 windows from five volunteers who were never used for training or for deciding when to stop (225 fall windows and 3,386 ADL windows). Two trained models appear in this section and we keep them apart on purpose. The </w:t>
       </w:r>
       <w:r>
         <w:rPr>
@@ -7246,7 +7294,7 @@
         <w:rPr>
           <w:rFonts w:ascii="Times New Roman" w:cs="Times New Roman" w:eastAsia="Times New Roman" w:hAnsi="Times New Roman"/>
         </w:rPr>
-        <w:t xml:space="preserve"> model is the seeded retraining that I compressed and timed. With the same code and the same split, the re-run scores higher than the shipped model (F1 0.86 against 0.72 at the 0.9 threshold). I take that as a sign that results vary from one training run to the next. I did not measure that spread over several seeds, and the shipped model's numbers should not be read next to the re-run's as if they came from one model.</w:t>
+        <w:t xml:space="preserve"> model is the seeded retraining that we compressed and timed. With the same code and the same split, the re-run scores higher than the shipped model (F1 0.86 against 0.72 at the 0.9 threshold). We take that as a sign that results vary from one training run to the next. We did not measure that spread over several seeds, and the shipped model's numbers should not be read next to the re-run's as if they came from one model.</w:t>
       </w:r>
     </w:p>
     <w:p>
@@ -8509,7 +8557,7 @@
         <w:rPr>
           <w:rFonts w:ascii="Times New Roman" w:cs="Times New Roman" w:eastAsia="Times New Roman" w:hAnsi="Times New Roman"/>
         </w:rPr>
-        <w:t xml:space="preserve">At the threshold I use, accuracy is identical across the two formats, so quantization has no visible accuracy cost on this task. The practical gain is that the edge model is a single 11.4 KB file that a phone can load with no Python runtime.</w:t>
+        <w:t xml:space="preserve">At the threshold we use, accuracy is identical across the two formats, so quantization has no visible accuracy cost on this task. The practical gain is that the edge model is a single 11.4 KB file that a phone can load with no Python runtime.</w:t>
       </w:r>
     </w:p>
     <w:p>
@@ -9628,7 +9676,7 @@
         <w:rPr>
           <w:rFonts w:ascii="Times New Roman" w:cs="Times New Roman" w:eastAsia="Times New Roman" w:hAnsi="Times New Roman"/>
         </w:rPr>
-        <w:t xml:space="preserve">Converting from the Keras file to a TFLite float32 file is the biggest single drop (76.9%), mostly because the .keras file carries training state. After that, quantization takes another 38.3% off and pruning takes 49.0% off. Pruning and quantization do not stack here, because of the 1,024-element rule from Section 3.2.2. The shipped model (11,664 bytes) is the quantized, unpruned variant. Runtime memory is mostly the 100 x 3 input buffer and the interpreter's own allocations, which I did not measure.</w:t>
+        <w:t xml:space="preserve">Converting from the Keras file to a TFLite float32 file is the biggest single drop (76.9%), mostly because the .keras file carries training state. After that, quantization takes another 38.3% off and pruning takes 49.0% off. Pruning and quantization do not stack here, because of the 1,024-element rule from Section 3.2.2. The shipped model (11,664 bytes) is the quantized, unpruned variant. Runtime memory is mostly the 100 x 3 input buffer and the interpreter's own allocations, which we did not measure.</w:t>
       </w:r>
     </w:p>
     <w:p>
@@ -11223,7 +11271,7 @@
         <w:rPr>
           <w:rFonts w:ascii="Times New Roman" w:cs="Times New Roman" w:eastAsia="Times New Roman" w:hAnsi="Times New Roman"/>
         </w:rPr>
-        <w:t xml:space="preserve">Every TFLite variant ran one window in under 0.01 ms on the server CPU, which is 6 to 9 microseconds. The differences among them are inside measurement noise: the pruned quantized model came out slower than the pruned float one even though the two are the same file size and structure. The app asks for an inference every 100 ms, so even a phone a hundred times slower than this server would spend a small fraction of its time on the model. I have not measured on the phone, and I expect the sensor timer, notifications and the foreground service to cost more battery than the model does, but I have not measured that either. A proper measurement on the Nothing Phone (3a) is the first item in Section 5.2.</w:t>
+        <w:t xml:space="preserve">Every TFLite variant ran one window in under 0.01 ms on the server CPU, which is 6 to 9 microseconds. The differences among them are inside measurement noise: the pruned quantized model came out slower than the pruned float one even though the two are the same file size and structure. The app asks for an inference every 100 ms, so even a phone a hundred times slower than this server would spend a small fraction of its time on the model. We have not measured on the phone, and we expect the sensor timer, notifications and the foreground service to cost more battery than the model does, but we have not measured that either. A proper measurement on the Nothing Phone (3a) is the first item in Section 5.2.</w:t>
       </w:r>
     </w:p>
     <w:p>
@@ -12201,7 +12249,7 @@
         <w:rPr>
           <w:rFonts w:ascii="Times New Roman" w:cs="Times New Roman" w:eastAsia="Times New Roman" w:hAnsi="Times New Roman"/>
         </w:rPr>
-        <w:t xml:space="preserve">The threshold moves the model along one curve. At 0.5 it finds 95.6% of falls but flags 7.8% of ordinary windows. At 0.95, which the app uses, it flags only 3.3% of ordinary windows but misses 19.1% of falls. I raised the app's threshold from 0.9 to 0.95 after trying it on the phone, because dropping the phone onto a soft surface set off alerts. The ROC curve in Figure 6 shows that the model separates the two classes well (AUC 0.968). The precision-recall curve explains why precision stays modest: only about 6% of test windows are falls, so even a 3.3% false-positive rate gives about two false alarms for every three real detections (113 against 182).</w:t>
+        <w:t xml:space="preserve">The threshold moves the model along one curve. At 0.5 it finds 95.6% of falls but flags 7.8% of ordinary windows. At 0.95, which the app uses, it flags only 3.3% of ordinary windows but misses 19.1% of falls. We raised the app's threshold from 0.9 to 0.95 after trying it on the phone, because dropping the phone onto a soft surface set off alerts. The ROC curve in Figure 6 shows that the model separates the two classes well (AUC 0.968). The precision-recall curve explains why precision stays modest: only about 6% of test windows are falls, so even a 3.3% false-positive rate gives about two false alarms for every three real detections (113 against 182).</w:t>
       </w:r>
     </w:p>
     <w:p>
@@ -12347,7 +12395,7 @@
         <w:rPr>
           <w:rFonts w:ascii="Times New Roman" w:cs="Times New Roman" w:eastAsia="Times New Roman" w:hAnsi="Times New Roman"/>
         </w:rPr>
-        <w:t xml:space="preserve">The two-consecutive-windows rule should lower false alarms further, because windows overlap heavily and a short spike is unlikely to repeat. I have not measured it. All the numbers above are per window on SisFall's trimmed clips, and an hour of a phone sitting in a pocket may look different. That is the biggest gap between these results and real use.</w:t>
+        <w:t xml:space="preserve">The two-consecutive-windows rule should lower false alarms further, because windows overlap heavily and a short spike is unlikely to repeat. We have not measured it. All the numbers above are per window on SisFall's trimmed clips, and an hour of a phone sitting in a pocket may look different. That is the biggest gap between these results and real use.</w:t>
       </w:r>
     </w:p>
     <w:p>
@@ -12502,7 +12550,7 @@
         <w:rPr>
           <w:rFonts w:ascii="Times New Roman" w:cs="Times New Roman" w:eastAsia="Times New Roman" w:hAnsi="Times New Roman"/>
         </w:rPr>
-        <w:t xml:space="preserve">Ship the pruned model if it holds up across seeds, and try quantization-aware training or full integer quantization if I move to hardware that needs it.</w:t>
+        <w:t xml:space="preserve">Ship the pruned model if it holds up across seeds, and try quantization-aware training or full integer quantization if we move to hardware that needs it.</w:t>
       </w:r>
     </w:p>
     <w:p>
@@ -12527,7 +12575,7 @@
         </w:rPr>
         <w:t xml:space="preserve">Source code, training scripts, results and this report's experiment scripts: </w:t>
       </w:r>
-      <w:hyperlink w:history="1" r:id="rIdegm6ujl3oqn1zt8stolq8">
+      <w:hyperlink w:history="1" r:id="rId5txfabdh5cqyzpaf8zh2f">
         <w:r>
           <w:rPr>
             <w:rFonts w:ascii="Times New Roman" w:cs="Times New Roman" w:eastAsia="Times New Roman" w:hAnsi="Times New Roman"/>
@@ -12549,7 +12597,7 @@
         </w:rPr>
         <w:t xml:space="preserve">Download the Android app (APK) from the Releases section: </w:t>
       </w:r>
-      <w:hyperlink w:history="1" r:id="rIda--et7inl3yyy0vsm5kfq">
+      <w:hyperlink w:history="1" r:id="rId5sjv6iwr0vysrw80naacw">
         <w:r>
           <w:rPr>
             <w:rFonts w:ascii="Times New Roman" w:cs="Times New Roman" w:eastAsia="Times New Roman" w:hAnsi="Times New Roman"/>
@@ -12565,7 +12613,7 @@
         </w:rPr>
         <w:t xml:space="preserve"> (release v0.1.0: </w:t>
       </w:r>
-      <w:hyperlink w:history="1" r:id="rId7-_5329ngr4tni77nn01e">
+      <w:hyperlink w:history="1" r:id="rId_oejxewpjauxdbck2_3af">
         <w:r>
           <w:rPr>
             <w:rFonts w:ascii="Times New Roman" w:cs="Times New Roman" w:eastAsia="Times New Roman" w:hAnsi="Times New Roman"/>
@@ -12742,7 +12790,7 @@
           <w:sz w:val="21"/>
           <w:szCs w:val="21"/>
         </w:rPr>
-        <w:t xml:space="preserve">[8] P. Mistry, "EdgeFall," https://github.com/altf4-games/EdgeFall.</w:t>
+        <w:t xml:space="preserve">[8] P. Mistry, R. Kokate, A. Raut and S. Gupta, "EdgeFall," https://github.com/altf4-games/EdgeFall.</w:t>
       </w:r>
     </w:p>
     <w:p>

</xml_diff>

<commit_message>
Report: add Team 14 to cover
Co-Authored-By: Claude Sonnet 5.5 <noreply@anthropic.com>
Claude-Session: https://claude.ai/code/session_01SARJowU4tQmSSTkW5fKqZq
</commit_message>
<xml_diff>
--- a/report/EdgeFall_Edge_AI_Report.docx
+++ b/report/EdgeFall_Edge_AI_Report.docx
@@ -82,7 +82,7 @@
     </w:p>
     <w:p>
       <w:pPr>
-        <w:spacing w:after="100" w:before="0"/>
+        <w:spacing w:after="60" w:before="0"/>
         <w:jc w:val="center"/>
       </w:pPr>
       <w:r>
@@ -97,7 +97,7 @@
     </w:p>
     <w:p>
       <w:pPr>
-        <w:spacing w:after="40" w:before="0"/>
+        <w:spacing w:after="100" w:before="0"/>
         <w:jc w:val="center"/>
       </w:pPr>
       <w:r>
@@ -108,7 +108,7 @@
           <w:sz w:val="26"/>
           <w:szCs w:val="26"/>
         </w:rPr>
-        <w:t xml:space="preserve">Pradyum Mistry</w:t>
+        <w:t xml:space="preserve">Team 14</w:t>
       </w:r>
     </w:p>
     <w:p>
@@ -124,7 +124,7 @@
           <w:sz w:val="26"/>
           <w:szCs w:val="26"/>
         </w:rPr>
-        <w:t xml:space="preserve">Rayan Kokate</w:t>
+        <w:t xml:space="preserve">Pradyum Mistry</w:t>
       </w:r>
     </w:p>
     <w:p>
@@ -140,7 +140,7 @@
           <w:sz w:val="26"/>
           <w:szCs w:val="26"/>
         </w:rPr>
-        <w:t xml:space="preserve">Aryan Raut</w:t>
+        <w:t xml:space="preserve">Rayan Kokate</w:t>
       </w:r>
     </w:p>
     <w:p>
@@ -156,6 +156,22 @@
           <w:sz w:val="26"/>
           <w:szCs w:val="26"/>
         </w:rPr>
+        <w:t xml:space="preserve">Aryan Raut</w:t>
+      </w:r>
+    </w:p>
+    <w:p>
+      <w:pPr>
+        <w:spacing w:after="40" w:before="0"/>
+        <w:jc w:val="center"/>
+      </w:pPr>
+      <w:r>
+        <w:rPr>
+          <w:rFonts w:ascii="Times New Roman" w:cs="Times New Roman" w:eastAsia="Times New Roman" w:hAnsi="Times New Roman"/>
+          <w:b/>
+          <w:bCs/>
+          <w:sz w:val="26"/>
+          <w:szCs w:val="26"/>
+        </w:rPr>
         <w:t xml:space="preserve">Satvik Gupta</w:t>
       </w:r>
     </w:p>
@@ -243,7 +259,7 @@
         </w:rPr>
         <w:t xml:space="preserve">Code: </w:t>
       </w:r>
-      <w:hyperlink w:history="1" r:id="rIdiobrgvtj5ct3nm0tf2min">
+      <w:hyperlink w:history="1" r:id="rIdhbvqixy0nb5avomvwa1s3">
         <w:r>
           <w:rPr>
             <w:rFonts w:ascii="Times New Roman" w:cs="Times New Roman" w:eastAsia="Times New Roman" w:hAnsi="Times New Roman"/>
@@ -267,7 +283,7 @@
         </w:rPr>
         <w:t xml:space="preserve">Download (Releases): </w:t>
       </w:r>
-      <w:hyperlink w:history="1" r:id="rIdn7j5k3gh7hm14to_nqhbz">
+      <w:hyperlink w:history="1" r:id="rIdcalxark4e47aytkqql7nc">
         <w:r>
           <w:rPr>
             <w:rFonts w:ascii="Times New Roman" w:cs="Times New Roman" w:eastAsia="Times New Roman" w:hAnsi="Times New Roman"/>
@@ -12575,7 +12591,7 @@
         </w:rPr>
         <w:t xml:space="preserve">Source code, training scripts, results and this report's experiment scripts: </w:t>
       </w:r>
-      <w:hyperlink w:history="1" r:id="rId5txfabdh5cqyzpaf8zh2f">
+      <w:hyperlink w:history="1" r:id="rIdnh47zmzra0hqa5owvm3y-">
         <w:r>
           <w:rPr>
             <w:rFonts w:ascii="Times New Roman" w:cs="Times New Roman" w:eastAsia="Times New Roman" w:hAnsi="Times New Roman"/>
@@ -12597,7 +12613,7 @@
         </w:rPr>
         <w:t xml:space="preserve">Download the Android app (APK) from the Releases section: </w:t>
       </w:r>
-      <w:hyperlink w:history="1" r:id="rId5sjv6iwr0vysrw80naacw">
+      <w:hyperlink w:history="1" r:id="rIdupsgubcejyuc74esh4vko">
         <w:r>
           <w:rPr>
             <w:rFonts w:ascii="Times New Roman" w:cs="Times New Roman" w:eastAsia="Times New Roman" w:hAnsi="Times New Roman"/>
@@ -12613,7 +12629,7 @@
         </w:rPr>
         <w:t xml:space="preserve"> (release v0.1.0: </w:t>
       </w:r>
-      <w:hyperlink w:history="1" r:id="rId_oejxewpjauxdbck2_3af">
+      <w:hyperlink w:history="1" r:id="rId4n1zpovuabygde2sdcvcy">
         <w:r>
           <w:rPr>
             <w:rFonts w:ascii="Times New Roman" w:cs="Times New Roman" w:eastAsia="Times New Roman" w:hAnsi="Times New Roman"/>

</xml_diff>